<commit_message>
Added beheer op afstand.
</commit_message>
<xml_diff>
--- a/documentatie/Adviesrapport/Verbetervoorstellen.docx
+++ b/documentatie/Adviesrapport/Verbetervoorstellen.docx
@@ -15,7 +15,6 @@
       </w:pPr>
       <w:bookmarkStart w:id="0" w:name="_Toc203692759"/>
       <w:bookmarkStart w:id="1" w:name="_Toc208320809"/>
-      <w:proofErr w:type="spellStart"/>
       <w:r>
         <w:rPr>
           <w:b/>
@@ -24,7 +23,6 @@
         <w:t>Verbetervoorstellen</w:t>
       </w:r>
       <w:bookmarkEnd w:id="0"/>
-      <w:proofErr w:type="spellEnd"/>
       <w:r>
         <w:rPr>
           <w:b/>
@@ -41,14 +39,12 @@
           <w:lang w:val="en-US"/>
         </w:rPr>
       </w:pPr>
-      <w:proofErr w:type="spellStart"/>
       <w:r>
         <w:rPr>
           <w:lang w:val="en-US"/>
         </w:rPr>
         <w:t>Applicatiebeveiliging</w:t>
       </w:r>
-      <w:proofErr w:type="spellEnd"/>
     </w:p>
     <w:p>
       <w:pPr>
@@ -79,15 +75,7 @@
         <w:t>In de front-end moet</w:t>
       </w:r>
       <w:r>
-        <w:t xml:space="preserve"> er een inputvalidatie komen voor de volgende </w:t>
-      </w:r>
-      <w:proofErr w:type="spellStart"/>
-      <w:r>
-        <w:t>inputs</w:t>
-      </w:r>
-      <w:proofErr w:type="spellEnd"/>
-      <w:r>
-        <w:t>:</w:t>
+        <w:t xml:space="preserve"> er een inputvalidatie komen voor de volgende inputs:</w:t>
       </w:r>
     </w:p>
     <w:p>
@@ -152,26 +140,10 @@
         </w:numPr>
       </w:pPr>
       <w:r>
-        <w:t xml:space="preserve">In de </w:t>
-      </w:r>
-      <w:proofErr w:type="spellStart"/>
-      <w:r>
-        <w:t>back-end</w:t>
-      </w:r>
-      <w:proofErr w:type="spellEnd"/>
-      <w:r>
-        <w:t xml:space="preserve"> moet</w:t>
-      </w:r>
-      <w:r>
-        <w:t xml:space="preserve"> er een inputvalidatie komen voor de volgende </w:t>
-      </w:r>
-      <w:proofErr w:type="spellStart"/>
-      <w:r>
-        <w:t>inputs</w:t>
-      </w:r>
-      <w:proofErr w:type="spellEnd"/>
-      <w:r>
-        <w:t>:</w:t>
+        <w:t>In de back-end moet</w:t>
+      </w:r>
+      <w:r>
+        <w:t xml:space="preserve"> er een inputvalidatie komen voor de volgende inputs:</w:t>
       </w:r>
     </w:p>
     <w:p>
@@ -183,39 +155,7 @@
         </w:numPr>
       </w:pPr>
       <w:r>
-        <w:t xml:space="preserve">Een strenge beveiliging waarvan deze op tags filtert. Deze tags moeten zowel in </w:t>
-      </w:r>
-      <w:proofErr w:type="spellStart"/>
-      <w:r>
-        <w:t>lowercase</w:t>
-      </w:r>
-      <w:proofErr w:type="spellEnd"/>
-      <w:r>
-        <w:t xml:space="preserve">, </w:t>
-      </w:r>
-      <w:proofErr w:type="spellStart"/>
-      <w:r>
-        <w:t>uppercase</w:t>
-      </w:r>
-      <w:proofErr w:type="spellEnd"/>
-      <w:r>
-        <w:t xml:space="preserve"> als </w:t>
-      </w:r>
-      <w:proofErr w:type="spellStart"/>
-      <w:r>
-        <w:t>gemixed</w:t>
-      </w:r>
-      <w:proofErr w:type="spellEnd"/>
-      <w:r>
-        <w:t xml:space="preserve"> worden </w:t>
-      </w:r>
-      <w:proofErr w:type="spellStart"/>
-      <w:r>
-        <w:t>gefiltered</w:t>
-      </w:r>
-      <w:proofErr w:type="spellEnd"/>
-      <w:r>
-        <w:t>.</w:t>
+        <w:t>Een strenge beveiliging waarvan deze op tags filtert. Deze tags moeten zowel in lowercase, uppercase als gemixed worden gefiltered.</w:t>
       </w:r>
     </w:p>
     <w:p>
@@ -227,31 +167,7 @@
         </w:numPr>
       </w:pPr>
       <w:r>
-        <w:t xml:space="preserve">Qua SQL </w:t>
-      </w:r>
-      <w:proofErr w:type="spellStart"/>
-      <w:r>
-        <w:t>injection</w:t>
-      </w:r>
-      <w:proofErr w:type="spellEnd"/>
-      <w:r>
-        <w:t xml:space="preserve"> moeten er </w:t>
-      </w:r>
-      <w:proofErr w:type="spellStart"/>
-      <w:r>
-        <w:t>beveilingsmaatregelen</w:t>
-      </w:r>
-      <w:proofErr w:type="spellEnd"/>
-      <w:r>
-        <w:t xml:space="preserve"> worden getroffen zoals </w:t>
-      </w:r>
-      <w:proofErr w:type="spellStart"/>
-      <w:r>
-        <w:t>prepared</w:t>
-      </w:r>
-      <w:proofErr w:type="spellEnd"/>
-      <w:r>
-        <w:t xml:space="preserve"> statements.</w:t>
+        <w:t>Qua SQL injection moeten er beveilingsmaatregelen worden getroffen zoals prepared statements.</w:t>
       </w:r>
     </w:p>
     <w:p>
@@ -263,7 +179,30 @@
         </w:numPr>
       </w:pPr>
       <w:r>
-        <w:t>Deze filters moeten hardnekkig worden getest om ervoor te zorgen dat er geen routes opstaan voor vormen van cross site scripting.</w:t>
+        <w:t>Deze filters moeten hardnekkig worden getest om ervoor te zorgen dat er geen routes opstaan voor vormen van cross site scripting</w:t>
+      </w:r>
+      <w:r>
+        <w:t xml:space="preserve"> en SQL injections</w:t>
+      </w:r>
+      <w:r>
+        <w:t>.</w:t>
+      </w:r>
+    </w:p>
+    <w:p/>
+    <w:p>
+      <w:pPr>
+        <w:pStyle w:val="Subtitle"/>
+      </w:pPr>
+      <w:r>
+        <w:t>Beheer op afstand:</w:t>
+      </w:r>
+    </w:p>
+    <w:p>
+      <w:r>
+        <w:t xml:space="preserve">Het beheer op afstand moet worden gerealiseerd via FortiClient. </w:t>
+      </w:r>
+      <w:r>
+        <w:t>Beheer op afstand moet alleen worden toegelaten via vooringenomen en toelaatbare IP adressen om te voorkomen dat ongekende actoren geen toegang tot het systeem kunnen verkrijgen.</w:t>
       </w:r>
     </w:p>
     <w:p>
@@ -308,15 +247,7 @@
         <w:t>Topologie en netwerkarchitectuur</w:t>
       </w:r>
       <w:r>
-        <w:t xml:space="preserve"> (nieuw ontwerp): segmentatie, DMZ, </w:t>
-      </w:r>
-      <w:proofErr w:type="spellStart"/>
-      <w:r>
-        <w:t>subnetten</w:t>
-      </w:r>
-      <w:proofErr w:type="spellEnd"/>
-      <w:r>
-        <w:t>.</w:t>
+        <w:t xml:space="preserve"> (nieuw ontwerp): segmentatie, DMZ, subnetten.</w:t>
       </w:r>
     </w:p>
     <w:p>
@@ -349,94 +280,28 @@
         <w:rPr>
           <w:lang w:val="en-US"/>
         </w:rPr>
-        <w:t xml:space="preserve"> </w:t>
-      </w:r>
-      <w:proofErr w:type="spellStart"/>
-      <w:r>
+        <w:t xml:space="preserve"> dataclassificatie, encryptie (in rust en transit).</w:t>
+      </w:r>
+    </w:p>
+    <w:p>
+      <w:pPr>
         <w:rPr>
           <w:lang w:val="en-US"/>
         </w:rPr>
-        <w:t>dataclassificatie</w:t>
-      </w:r>
-      <w:proofErr w:type="spellEnd"/>
-      <w:r>
-        <w:rPr>
-          <w:lang w:val="en-US"/>
-        </w:rPr>
-        <w:t xml:space="preserve">, </w:t>
-      </w:r>
-      <w:proofErr w:type="spellStart"/>
-      <w:r>
-        <w:rPr>
-          <w:lang w:val="en-US"/>
-        </w:rPr>
-        <w:t>encryptie</w:t>
-      </w:r>
-      <w:proofErr w:type="spellEnd"/>
-      <w:r>
-        <w:rPr>
-          <w:lang w:val="en-US"/>
-        </w:rPr>
-        <w:t xml:space="preserve"> (in rust </w:t>
-      </w:r>
-      <w:proofErr w:type="spellStart"/>
-      <w:r>
-        <w:rPr>
-          <w:lang w:val="en-US"/>
-        </w:rPr>
-        <w:t>en</w:t>
-      </w:r>
-      <w:proofErr w:type="spellEnd"/>
-      <w:r>
-        <w:rPr>
-          <w:lang w:val="en-US"/>
-        </w:rPr>
-        <w:t xml:space="preserve"> transit).</w:t>
-      </w:r>
-    </w:p>
-    <w:p>
-      <w:pPr>
-        <w:rPr>
-          <w:lang w:val="en-US"/>
-        </w:rPr>
-      </w:pPr>
-      <w:proofErr w:type="spellStart"/>
+      </w:pPr>
       <w:r>
         <w:rPr>
           <w:b/>
           <w:bCs/>
           <w:lang w:val="en-US"/>
         </w:rPr>
-        <w:t>Applicatiebeveiliging</w:t>
-      </w:r>
-      <w:proofErr w:type="spellEnd"/>
-      <w:r>
-        <w:rPr>
-          <w:b/>
-          <w:bCs/>
+        <w:t>Applicatiebeveiliging:</w:t>
+      </w:r>
+      <w:r>
+        <w:rPr>
           <w:lang w:val="en-US"/>
         </w:rPr>
-        <w:t>:</w:t>
-      </w:r>
-      <w:r>
-        <w:rPr>
-          <w:lang w:val="en-US"/>
-        </w:rPr>
-        <w:t xml:space="preserve"> </w:t>
-      </w:r>
-      <w:proofErr w:type="spellStart"/>
-      <w:r>
-        <w:rPr>
-          <w:lang w:val="en-US"/>
-        </w:rPr>
-        <w:t>inputvalidatie</w:t>
-      </w:r>
-      <w:proofErr w:type="spellEnd"/>
-      <w:r>
-        <w:rPr>
-          <w:lang w:val="en-US"/>
-        </w:rPr>
-        <w:t>, code review, secure coding.</w:t>
+        <w:t xml:space="preserve"> inputvalidatie, code review, secure coding.</w:t>
       </w:r>
     </w:p>
     <w:p>

</xml_diff>